<commit_message>
Complete Experiment 8 write-up: implementation, output screenshots, conclusion
Co-Authored-By: Claude <noreply@anthropic.com>
</commit_message>
<xml_diff>
--- a/docs/Experiment_08.docx
+++ b/docs/Experiment_08.docx
@@ -1223,15 +1223,7 @@
           <w:b w:val="1"/>
           <w:rtl w:val="0"/>
         </w:rPr>
-        <w:t xml:space="preserve">. </w:t>
-      </w:r>
-      <w:r>
-        <w:rPr>
-          <w:rFonts w:ascii="Times New Roman" w:cs="Times New Roman" w:eastAsia="Times New Roman" w:hAnsi="Times New Roman"/>
-          <w:b w:val="1"/>
-          <w:rtl w:val="0"/>
-        </w:rPr>
-        <w:t xml:space="preserve">Collect name, designation, joining date to begin with. </w:t>
+        <w:t xml:space="preserve">. Collect name, designation, joining date to begin with. </w:t>
       </w:r>
     </w:p>
     <w:p>
@@ -1635,6 +1627,1513 @@
         <w:rPr>
           <w:rtl w:val="0"/>
         </w:rPr>
+      </w:r>
+    </w:p>
+    <w:p>
+      <w:pPr>
+        <w:spacing w:before="360" w:after="160"/>
+        <w:rPr>
+          <w:rFonts w:ascii="Times New Roman" w:cs="Times New Roman" w:eastAsia="Times New Roman" w:hAnsi="Times New Roman"/>
+        </w:rPr>
+      </w:pPr>
+      <w:r>
+        <w:rPr>
+          <w:rFonts w:ascii="Times New Roman" w:cs="Times New Roman" w:eastAsia="Times New Roman" w:hAnsi="Times New Roman"/>
+          <w:b w:val="1"/>
+        </w:rPr>
+        <w:t xml:space="preserve">Implementation:</w:t>
+      </w:r>
+    </w:p>
+    <w:p>
+      <w:pPr>
+        <w:spacing w:after="160"/>
+        <w:rPr>
+          <w:rFonts w:ascii="Times New Roman" w:cs="Times New Roman" w:eastAsia="Times New Roman" w:hAnsi="Times New Roman"/>
+        </w:rPr>
+      </w:pPr>
+      <w:r>
+        <w:rPr>
+          <w:rFonts w:ascii="Times New Roman" w:cs="Times New Roman" w:eastAsia="Times New Roman" w:hAnsi="Times New Roman"/>
+        </w:rPr>
+        <w:t xml:space="preserve">The chatbot is written in Python using LangChain. Each of the four tasks in Exercise 01 is a separate script, and the finished app is deployed on Streamlit Community Cloud.</w:t>
+      </w:r>
+    </w:p>
+    <w:p>
+      <w:pPr>
+        <w:spacing w:after="40"/>
+        <w:rPr>
+          <w:rFonts w:ascii="Times New Roman" w:cs="Times New Roman" w:eastAsia="Times New Roman" w:hAnsi="Times New Roman"/>
+        </w:rPr>
+      </w:pPr>
+      <w:r>
+        <w:rPr>
+          <w:rFonts w:ascii="Times New Roman" w:cs="Times New Roman" w:eastAsia="Times New Roman" w:hAnsi="Times New Roman"/>
+          <w:b w:val="1"/>
+        </w:rPr>
+        <w:t xml:space="preserve">Live app: </w:t>
+      </w:r>
+      <w:hyperlink r:id="rId201">
+        <w:r>
+          <w:rPr>
+            <w:rFonts w:ascii="Times New Roman" w:cs="Times New Roman" w:eastAsia="Times New Roman" w:hAnsi="Times New Roman"/>
+            <w:color w:val="1155cc"/>
+            <w:u w:val="single"/>
+          </w:rPr>
+          <w:t xml:space="preserve">https://lrm-rag.streamlit.app/</w:t>
+        </w:r>
+      </w:hyperlink>
+    </w:p>
+    <w:p>
+      <w:pPr>
+        <w:spacing w:after="160"/>
+        <w:rPr>
+          <w:rFonts w:ascii="Times New Roman" w:cs="Times New Roman" w:eastAsia="Times New Roman" w:hAnsi="Times New Roman"/>
+        </w:rPr>
+      </w:pPr>
+      <w:r>
+        <w:rPr>
+          <w:rFonts w:ascii="Times New Roman" w:cs="Times New Roman" w:eastAsia="Times New Roman" w:hAnsi="Times New Roman"/>
+          <w:b w:val="1"/>
+        </w:rPr>
+        <w:t xml:space="preserve">Source code: </w:t>
+      </w:r>
+      <w:hyperlink r:id="rId202">
+        <w:r>
+          <w:rPr>
+            <w:rFonts w:ascii="Times New Roman" w:cs="Times New Roman" w:eastAsia="Times New Roman" w:hAnsi="Times New Roman"/>
+            <w:color w:val="1155cc"/>
+            <w:u w:val="single"/>
+          </w:rPr>
+          <w:t xml:space="preserve">https://github.com/Shrutiiicodes/lrm-rag</w:t>
+        </w:r>
+      </w:hyperlink>
+    </w:p>
+    <w:p>
+      <w:pPr>
+        <w:pStyle w:val="Heading3"/>
+        <w:keepNext/>
+        <w:spacing w:before="240" w:after="120"/>
+        <w:rPr>
+          <w:rFonts w:ascii="Times New Roman" w:cs="Times New Roman" w:eastAsia="Times New Roman" w:hAnsi="Times New Roman"/>
+        </w:rPr>
+      </w:pPr>
+      <w:r>
+        <w:rPr>
+          <w:rFonts w:ascii="Times New Roman" w:cs="Times New Roman" w:eastAsia="Times New Roman" w:hAnsi="Times New Roman"/>
+          <w:b w:val="1"/>
+          <w:color w:val="000000"/>
+          <w:sz w:val="24"/>
+          <w:szCs w:val="24"/>
+        </w:rPr>
+        <w:t xml:space="preserve">Tools and Technologies</w:t>
+      </w:r>
+    </w:p>
+    <w:p>
+      <w:pPr>
+        <w:numPr>
+          <w:ilvl w:val="0"/>
+          <w:numId w:val="9"/>
+        </w:numPr>
+        <w:spacing w:before="0" w:after="40"/>
+        <w:ind w:left="720" w:hanging="360"/>
+        <w:rPr>
+          <w:rFonts w:ascii="Times New Roman" w:cs="Times New Roman" w:eastAsia="Times New Roman" w:hAnsi="Times New Roman"/>
+        </w:rPr>
+      </w:pPr>
+      <w:r>
+        <w:rPr>
+          <w:rFonts w:ascii="Times New Roman" w:cs="Times New Roman" w:eastAsia="Times New Roman" w:hAnsi="Times New Roman"/>
+          <w:b w:val="1"/>
+        </w:rPr>
+        <w:t xml:space="preserve">Data collection:</w:t>
+      </w:r>
+      <w:r>
+        <w:rPr>
+          <w:rFonts w:ascii="Times New Roman" w:cs="Times New Roman" w:eastAsia="Times New Roman" w:hAnsi="Times New Roman"/>
+        </w:rPr>
+        <w:t xml:space="preserve"> requests and BeautifulSoup (web scraping), pypdf (PDF to text).</w:t>
+      </w:r>
+    </w:p>
+    <w:p>
+      <w:pPr>
+        <w:numPr>
+          <w:ilvl w:val="0"/>
+          <w:numId w:val="9"/>
+        </w:numPr>
+        <w:spacing w:before="0" w:after="40"/>
+        <w:ind w:left="720" w:hanging="360"/>
+        <w:rPr>
+          <w:rFonts w:ascii="Times New Roman" w:cs="Times New Roman" w:eastAsia="Times New Roman" w:hAnsi="Times New Roman"/>
+        </w:rPr>
+      </w:pPr>
+      <w:r>
+        <w:rPr>
+          <w:rFonts w:ascii="Times New Roman" w:cs="Times New Roman" w:eastAsia="Times New Roman" w:hAnsi="Times New Roman"/>
+          <w:b w:val="1"/>
+        </w:rPr>
+        <w:t xml:space="preserve">Framework:</w:t>
+      </w:r>
+      <w:r>
+        <w:rPr>
+          <w:rFonts w:ascii="Times New Roman" w:cs="Times New Roman" w:eastAsia="Times New Roman" w:hAnsi="Times New Roman"/>
+        </w:rPr>
+        <w:t xml:space="preserve"> LangChain (documents, text splitter, vector store, prompt templates and LCEL chains).</w:t>
+      </w:r>
+    </w:p>
+    <w:p>
+      <w:pPr>
+        <w:numPr>
+          <w:ilvl w:val="0"/>
+          <w:numId w:val="9"/>
+        </w:numPr>
+        <w:spacing w:before="0" w:after="40"/>
+        <w:ind w:left="720" w:hanging="360"/>
+        <w:rPr>
+          <w:rFonts w:ascii="Times New Roman" w:cs="Times New Roman" w:eastAsia="Times New Roman" w:hAnsi="Times New Roman"/>
+        </w:rPr>
+      </w:pPr>
+      <w:r>
+        <w:rPr>
+          <w:rFonts w:ascii="Times New Roman" w:cs="Times New Roman" w:eastAsia="Times New Roman" w:hAnsi="Times New Roman"/>
+          <w:b w:val="1"/>
+        </w:rPr>
+        <w:t xml:space="preserve">Embedding model:</w:t>
+      </w:r>
+      <w:r>
+        <w:rPr>
+          <w:rFonts w:ascii="Times New Roman" w:cs="Times New Roman" w:eastAsia="Times New Roman" w:hAnsi="Times New Roman"/>
+        </w:rPr>
+        <w:t xml:space="preserve"> sentence-transformers/all-MiniLM-L6-v2 from Hugging Face, which runs locally and produces 384-dimensional vectors.</w:t>
+      </w:r>
+    </w:p>
+    <w:p>
+      <w:pPr>
+        <w:numPr>
+          <w:ilvl w:val="0"/>
+          <w:numId w:val="9"/>
+        </w:numPr>
+        <w:spacing w:before="0" w:after="40"/>
+        <w:ind w:left="720" w:hanging="360"/>
+        <w:rPr>
+          <w:rFonts w:ascii="Times New Roman" w:cs="Times New Roman" w:eastAsia="Times New Roman" w:hAnsi="Times New Roman"/>
+        </w:rPr>
+      </w:pPr>
+      <w:r>
+        <w:rPr>
+          <w:rFonts w:ascii="Times New Roman" w:cs="Times New Roman" w:eastAsia="Times New Roman" w:hAnsi="Times New Roman"/>
+          <w:b w:val="1"/>
+        </w:rPr>
+        <w:t xml:space="preserve">Vector database:</w:t>
+      </w:r>
+      <w:r>
+        <w:rPr>
+          <w:rFonts w:ascii="Times New Roman" w:cs="Times New Roman" w:eastAsia="Times New Roman" w:hAnsi="Times New Roman"/>
+        </w:rPr>
+        <w:t xml:space="preserve"> FAISS.</w:t>
+      </w:r>
+    </w:p>
+    <w:p>
+      <w:pPr>
+        <w:numPr>
+          <w:ilvl w:val="0"/>
+          <w:numId w:val="9"/>
+        </w:numPr>
+        <w:spacing w:before="0" w:after="40"/>
+        <w:ind w:left="720" w:hanging="360"/>
+        <w:rPr>
+          <w:rFonts w:ascii="Times New Roman" w:cs="Times New Roman" w:eastAsia="Times New Roman" w:hAnsi="Times New Roman"/>
+        </w:rPr>
+      </w:pPr>
+      <w:r>
+        <w:rPr>
+          <w:rFonts w:ascii="Times New Roman" w:cs="Times New Roman" w:eastAsia="Times New Roman" w:hAnsi="Times New Roman"/>
+          <w:b w:val="1"/>
+        </w:rPr>
+        <w:t xml:space="preserve">LLM:</w:t>
+      </w:r>
+      <w:r>
+        <w:rPr>
+          <w:rFonts w:ascii="Times New Roman" w:cs="Times New Roman" w:eastAsia="Times New Roman" w:hAnsi="Times New Roman"/>
+        </w:rPr>
+        <w:t xml:space="preserve"> openai/gpt-oss-120b (answers) and openai/gpt-oss-20b (query routing), both open-weight models served through the Groq API. Groq has retired its Llama 3 models, so gpt-oss is used instead.</w:t>
+      </w:r>
+    </w:p>
+    <w:p>
+      <w:pPr>
+        <w:numPr>
+          <w:ilvl w:val="0"/>
+          <w:numId w:val="9"/>
+        </w:numPr>
+        <w:spacing w:before="0" w:after="160"/>
+        <w:ind w:left="720" w:hanging="360"/>
+        <w:rPr>
+          <w:rFonts w:ascii="Times New Roman" w:cs="Times New Roman" w:eastAsia="Times New Roman" w:hAnsi="Times New Roman"/>
+        </w:rPr>
+      </w:pPr>
+      <w:r>
+        <w:rPr>
+          <w:rFonts w:ascii="Times New Roman" w:cs="Times New Roman" w:eastAsia="Times New Roman" w:hAnsi="Times New Roman"/>
+          <w:b w:val="1"/>
+        </w:rPr>
+        <w:t xml:space="preserve">Frontend and deployment:</w:t>
+      </w:r>
+      <w:r>
+        <w:rPr>
+          <w:rFonts w:ascii="Times New Roman" w:cs="Times New Roman" w:eastAsia="Times New Roman" w:hAnsi="Times New Roman"/>
+        </w:rPr>
+        <w:t xml:space="preserve"> Streamlit, hosted on Streamlit Community Cloud.</w:t>
+      </w:r>
+    </w:p>
+    <w:p>
+      <w:pPr>
+        <w:pStyle w:val="Heading3"/>
+        <w:keepNext/>
+        <w:spacing w:before="240" w:after="120"/>
+        <w:rPr>
+          <w:rFonts w:ascii="Times New Roman" w:cs="Times New Roman" w:eastAsia="Times New Roman" w:hAnsi="Times New Roman"/>
+        </w:rPr>
+      </w:pPr>
+      <w:r>
+        <w:rPr>
+          <w:rFonts w:ascii="Times New Roman" w:cs="Times New Roman" w:eastAsia="Times New Roman" w:hAnsi="Times New Roman"/>
+          <w:b w:val="1"/>
+          <w:color w:val="000000"/>
+          <w:sz w:val="24"/>
+          <w:szCs w:val="24"/>
+        </w:rPr>
+        <w:t xml:space="preserve">System Architecture</w:t>
+      </w:r>
+    </w:p>
+    <w:p>
+      <w:pPr>
+        <w:spacing w:after="120"/>
+        <w:rPr>
+          <w:rFonts w:ascii="Times New Roman" w:cs="Times New Roman" w:eastAsia="Times New Roman" w:hAnsi="Times New Roman"/>
+        </w:rPr>
+      </w:pPr>
+      <w:r>
+        <w:rPr>
+          <w:rFonts w:ascii="Times New Roman" w:cs="Times New Roman" w:eastAsia="Times New Roman" w:hAnsi="Times New Roman"/>
+        </w:rPr>
+        <w:t xml:space="preserve">User question → Query router → Retriever (FAISS + metadata filters) → Prompt constructor → LLM → Answer shown in the Streamlit chat.</w:t>
+      </w:r>
+    </w:p>
+    <w:p>
+      <w:pPr>
+        <w:numPr>
+          <w:ilvl w:val="0"/>
+          <w:numId w:val="9"/>
+        </w:numPr>
+        <w:spacing w:before="0" w:after="40"/>
+        <w:ind w:left="720" w:hanging="360"/>
+        <w:rPr>
+          <w:rFonts w:ascii="Times New Roman" w:cs="Times New Roman" w:eastAsia="Times New Roman" w:hAnsi="Times New Roman"/>
+        </w:rPr>
+      </w:pPr>
+      <w:r>
+        <w:rPr>
+          <w:rFonts w:ascii="Times New Roman" w:cs="Times New Roman" w:eastAsia="Times New Roman" w:hAnsi="Times New Roman"/>
+          <w:b w:val="1"/>
+        </w:rPr>
+        <w:t xml:space="preserve">Query router:</w:t>
+      </w:r>
+      <w:r>
+        <w:rPr>
+          <w:rFonts w:ascii="Times New Roman" w:cs="Times New Roman" w:eastAsia="Times New Roman" w:hAnsi="Times New Roman"/>
+        </w:rPr>
+        <w:t xml:space="preserve"> an LLM call rewrites the question as a standalone question, using the chat history, and identifies its topic (faculty, department, syllabus or other) and the semesters it refers to.</w:t>
+      </w:r>
+    </w:p>
+    <w:p>
+      <w:pPr>
+        <w:numPr>
+          <w:ilvl w:val="0"/>
+          <w:numId w:val="9"/>
+        </w:numPr>
+        <w:spacing w:before="0" w:after="40"/>
+        <w:ind w:left="720" w:hanging="360"/>
+        <w:rPr>
+          <w:rFonts w:ascii="Times New Roman" w:cs="Times New Roman" w:eastAsia="Times New Roman" w:hAnsi="Times New Roman"/>
+        </w:rPr>
+      </w:pPr>
+      <w:r>
+        <w:rPr>
+          <w:rFonts w:ascii="Times New Roman" w:cs="Times New Roman" w:eastAsia="Times New Roman" w:hAnsi="Times New Roman"/>
+          <w:b w:val="1"/>
+        </w:rPr>
+        <w:t xml:space="preserve">Retriever:</w:t>
+      </w:r>
+      <w:r>
+        <w:rPr>
+          <w:rFonts w:ascii="Times New Roman" w:cs="Times New Roman" w:eastAsia="Times New Roman" w:hAnsi="Times New Roman"/>
+        </w:rPr>
+        <w:t xml:space="preserve"> searches the FAISS index for the most relevant chunks, restricted to the right semesters or data source.</w:t>
+      </w:r>
+    </w:p>
+    <w:p>
+      <w:pPr>
+        <w:numPr>
+          <w:ilvl w:val="0"/>
+          <w:numId w:val="9"/>
+        </w:numPr>
+        <w:spacing w:before="0" w:after="40"/>
+        <w:ind w:left="720" w:hanging="360"/>
+        <w:rPr>
+          <w:rFonts w:ascii="Times New Roman" w:cs="Times New Roman" w:eastAsia="Times New Roman" w:hAnsi="Times New Roman"/>
+        </w:rPr>
+      </w:pPr>
+      <w:r>
+        <w:rPr>
+          <w:rFonts w:ascii="Times New Roman" w:cs="Times New Roman" w:eastAsia="Times New Roman" w:hAnsi="Times New Roman"/>
+          <w:b w:val="1"/>
+        </w:rPr>
+        <w:t xml:space="preserve">Prompt constructor:</w:t>
+      </w:r>
+      <w:r>
+        <w:rPr>
+          <w:rFonts w:ascii="Times New Roman" w:cs="Times New Roman" w:eastAsia="Times New Roman" w:hAnsi="Times New Roman"/>
+        </w:rPr>
+        <w:t xml:space="preserve"> merges the retrieved chunks with the question and instructs the model to answer only from this context.</w:t>
+      </w:r>
+    </w:p>
+    <w:p>
+      <w:pPr>
+        <w:numPr>
+          <w:ilvl w:val="0"/>
+          <w:numId w:val="9"/>
+        </w:numPr>
+        <w:spacing w:before="0" w:after="160"/>
+        <w:ind w:left="720" w:hanging="360"/>
+        <w:rPr>
+          <w:rFonts w:ascii="Times New Roman" w:cs="Times New Roman" w:eastAsia="Times New Roman" w:hAnsi="Times New Roman"/>
+        </w:rPr>
+      </w:pPr>
+      <w:r>
+        <w:rPr>
+          <w:rFonts w:ascii="Times New Roman" w:cs="Times New Roman" w:eastAsia="Times New Roman" w:hAnsi="Times New Roman"/>
+          <w:b w:val="1"/>
+        </w:rPr>
+        <w:t xml:space="preserve">Generative LLM:</w:t>
+      </w:r>
+      <w:r>
+        <w:rPr>
+          <w:rFonts w:ascii="Times New Roman" w:cs="Times New Roman" w:eastAsia="Times New Roman" w:hAnsi="Times New Roman"/>
+        </w:rPr>
+        <w:t xml:space="preserve"> gpt-oss-120b writes the final answer, or says it doesn't know when the context does not contain the answer.</w:t>
+      </w:r>
+    </w:p>
+    <w:p>
+      <w:pPr>
+        <w:pStyle w:val="Heading3"/>
+        <w:keepNext/>
+        <w:spacing w:before="240" w:after="120"/>
+        <w:rPr>
+          <w:rFonts w:ascii="Times New Roman" w:cs="Times New Roman" w:eastAsia="Times New Roman" w:hAnsi="Times New Roman"/>
+        </w:rPr>
+      </w:pPr>
+      <w:r>
+        <w:rPr>
+          <w:rFonts w:ascii="Times New Roman" w:cs="Times New Roman" w:eastAsia="Times New Roman" w:hAnsi="Times New Roman"/>
+          <w:b w:val="1"/>
+          <w:color w:val="000000"/>
+          <w:sz w:val="24"/>
+          <w:szCs w:val="24"/>
+        </w:rPr>
+        <w:t xml:space="preserve">1. Data Collection (scrape.py)</w:t>
+      </w:r>
+    </w:p>
+    <w:p>
+      <w:pPr>
+        <w:numPr>
+          <w:ilvl w:val="0"/>
+          <w:numId w:val="9"/>
+        </w:numPr>
+        <w:spacing w:before="0" w:after="40"/>
+        <w:ind w:left="720" w:hanging="360"/>
+        <w:rPr>
+          <w:rFonts w:ascii="Times New Roman" w:cs="Times New Roman" w:eastAsia="Times New Roman" w:hAnsi="Times New Roman"/>
+        </w:rPr>
+      </w:pPr>
+      <w:r>
+        <w:rPr>
+          <w:rFonts w:ascii="Times New Roman" w:cs="Times New Roman" w:eastAsia="Times New Roman" w:hAnsi="Times New Roman"/>
+          <w:b w:val="1"/>
+        </w:rPr>
+        <w:t xml:space="preserve">Faculty:</w:t>
+      </w:r>
+      <w:r>
+        <w:rPr>
+          <w:rFonts w:ascii="Times New Roman" w:cs="Times New Roman" w:eastAsia="Times New Roman" w:hAnsi="Times New Roman"/>
+        </w:rPr>
+        <w:t xml:space="preserve"> the CSE (DS) faculty page was scraped for the name, designation and joining date of all 20 faculty members. The website mixes date formats (02.07.2007 and 01-09-2023), so all dates were normalised (e.g. 2 July 2007) and each person was written as one sentence.</w:t>
+      </w:r>
+    </w:p>
+    <w:p>
+      <w:pPr>
+        <w:numPr>
+          <w:ilvl w:val="0"/>
+          <w:numId w:val="9"/>
+        </w:numPr>
+        <w:spacing w:before="0" w:after="40"/>
+        <w:ind w:left="720" w:hanging="360"/>
+        <w:rPr>
+          <w:rFonts w:ascii="Times New Roman" w:cs="Times New Roman" w:eastAsia="Times New Roman" w:hAnsi="Times New Roman"/>
+        </w:rPr>
+      </w:pPr>
+      <w:r>
+        <w:rPr>
+          <w:rFonts w:ascii="Times New Roman" w:cs="Times New Roman" w:eastAsia="Times New Roman" w:hAnsi="Times New Roman"/>
+          <w:b w:val="1"/>
+        </w:rPr>
+        <w:t xml:space="preserve">Department information:</w:t>
+      </w:r>
+      <w:r>
+        <w:rPr>
+          <w:rFonts w:ascii="Times New Roman" w:cs="Times New Roman" w:eastAsia="Times New Roman" w:hAnsi="Times New Roman"/>
+        </w:rPr>
+        <w:t xml:space="preserve"> the department's About Us text and key points (year of establishment 2020, intake 180).</w:t>
+      </w:r>
+    </w:p>
+    <w:p>
+      <w:pPr>
+        <w:numPr>
+          <w:ilvl w:val="0"/>
+          <w:numId w:val="9"/>
+        </w:numPr>
+        <w:spacing w:before="0" w:after="40"/>
+        <w:ind w:left="720" w:hanging="360"/>
+        <w:rPr>
+          <w:rFonts w:ascii="Times New Roman" w:cs="Times New Roman" w:eastAsia="Times New Roman" w:hAnsi="Times New Roman"/>
+        </w:rPr>
+      </w:pPr>
+      <w:r>
+        <w:rPr>
+          <w:rFonts w:ascii="Times New Roman" w:cs="Times New Roman" w:eastAsia="Times New Roman" w:hAnsi="Times New Roman"/>
+          <w:b w:val="1"/>
+        </w:rPr>
+        <w:t xml:space="preserve">Syllabus:</w:t>
+      </w:r>
+      <w:r>
+        <w:rPr>
+          <w:rFonts w:ascii="Times New Roman" w:cs="Times New Roman" w:eastAsia="Times New Roman" w:hAnsi="Times New Roman"/>
+        </w:rPr>
+        <w:t xml:space="preserve"> the syllabus table on the department page was parsed to pick the latest-scheme (DJS23) PDF for Semesters III to VIII. Semesters I and II come from the common first-year DJS23 PDF on the Basic Science &amp; Humanities page, which was split into the two semesters.</w:t>
+      </w:r>
+    </w:p>
+    <w:p>
+      <w:pPr>
+        <w:numPr>
+          <w:ilvl w:val="0"/>
+          <w:numId w:val="9"/>
+        </w:numPr>
+        <w:spacing w:before="0" w:after="160"/>
+        <w:ind w:left="720" w:hanging="360"/>
+        <w:rPr>
+          <w:rFonts w:ascii="Times New Roman" w:cs="Times New Roman" w:eastAsia="Times New Roman" w:hAnsi="Times New Roman"/>
+        </w:rPr>
+      </w:pPr>
+      <w:r>
+        <w:rPr>
+          <w:rFonts w:ascii="Times New Roman" w:cs="Times New Roman" w:eastAsia="Times New Roman" w:hAnsi="Times New Roman"/>
+        </w:rPr>
+        <w:t xml:space="preserve">All data was cleaned and saved as plain text files: faculty.txt, about.txt and syllabus_sem1.txt to syllabus_sem8.txt.</w:t>
+      </w:r>
+    </w:p>
+    <w:p>
+      <w:pPr>
+        <w:shd w:val="clear" w:color="auto" w:fill="F2F2F2"/>
+        <w:spacing w:before="80" w:after="0" w:line="240" w:lineRule="auto"/>
+        <w:ind w:left="360" w:right="360"/>
+        <w:rPr>
+          <w:rFonts w:ascii="Consolas" w:cs="Consolas" w:eastAsia="Consolas" w:hAnsi="Consolas"/>
+          <w:sz w:val="16"/>
+        </w:rPr>
+      </w:pPr>
+      <w:r>
+        <w:rPr>
+          <w:rFonts w:ascii="Consolas" w:cs="Consolas" w:eastAsia="Consolas" w:hAnsi="Consolas"/>
+          <w:sz w:val="16"/>
+          <w:szCs w:val="16"/>
+        </w:rPr>
+        <w:t xml:space="preserve">for card in soup(FACULTY_URL).select("div.shadow"):</w:t>
+      </w:r>
+    </w:p>
+    <w:p>
+      <w:pPr>
+        <w:shd w:val="clear" w:color="auto" w:fill="F2F2F2"/>
+        <w:spacing w:before="0" w:after="0" w:line="240" w:lineRule="auto"/>
+        <w:ind w:left="360" w:right="360"/>
+        <w:rPr>
+          <w:rFonts w:ascii="Consolas" w:cs="Consolas" w:eastAsia="Consolas" w:hAnsi="Consolas"/>
+          <w:sz w:val="16"/>
+        </w:rPr>
+      </w:pPr>
+      <w:r>
+        <w:rPr>
+          <w:rFonts w:ascii="Consolas" w:cs="Consolas" w:eastAsia="Consolas" w:hAnsi="Consolas"/>
+          <w:sz w:val="16"/>
+          <w:szCs w:val="16"/>
+        </w:rPr>
+        <w:t xml:space="preserve">    spans = [s.get_text(" ", strip=True) for s in card.find_all("span")]</w:t>
+      </w:r>
+    </w:p>
+    <w:p>
+      <w:pPr>
+        <w:shd w:val="clear" w:color="auto" w:fill="F2F2F2"/>
+        <w:spacing w:before="0" w:after="0" w:line="240" w:lineRule="auto"/>
+        <w:ind w:left="360" w:right="360"/>
+        <w:rPr>
+          <w:rFonts w:ascii="Consolas" w:cs="Consolas" w:eastAsia="Consolas" w:hAnsi="Consolas"/>
+          <w:sz w:val="16"/>
+        </w:rPr>
+      </w:pPr>
+      <w:r>
+        <w:rPr>
+          <w:rFonts w:ascii="Consolas" w:cs="Consolas" w:eastAsia="Consolas" w:hAnsi="Consolas"/>
+          <w:sz w:val="16"/>
+          <w:szCs w:val="16"/>
+        </w:rPr>
+        <w:t xml:space="preserve">    name, desig, joined = spans[:3]</w:t>
+      </w:r>
+    </w:p>
+    <w:p>
+      <w:pPr>
+        <w:shd w:val="clear" w:color="auto" w:fill="F2F2F2"/>
+        <w:spacing w:before="0" w:after="0" w:line="240" w:lineRule="auto"/>
+        <w:ind w:left="360" w:right="360"/>
+        <w:rPr>
+          <w:rFonts w:ascii="Consolas" w:cs="Consolas" w:eastAsia="Consolas" w:hAnsi="Consolas"/>
+          <w:sz w:val="16"/>
+        </w:rPr>
+      </w:pPr>
+      <w:r>
+        <w:rPr>
+          <w:rFonts w:ascii="Consolas" w:cs="Consolas" w:eastAsia="Consolas" w:hAnsi="Consolas"/>
+          <w:sz w:val="16"/>
+          <w:szCs w:val="16"/>
+        </w:rPr>
+        <w:t xml:space="preserve">    raw = joined.removeprefix("Joined on").strip()   # "02.07.2007" or "01-09-2023"</w:t>
+      </w:r>
+    </w:p>
+    <w:p>
+      <w:pPr>
+        <w:shd w:val="clear" w:color="auto" w:fill="F2F2F2"/>
+        <w:spacing w:before="0" w:after="0" w:line="240" w:lineRule="auto"/>
+        <w:ind w:left="360" w:right="360"/>
+        <w:rPr>
+          <w:rFonts w:ascii="Consolas" w:cs="Consolas" w:eastAsia="Consolas" w:hAnsi="Consolas"/>
+          <w:sz w:val="16"/>
+        </w:rPr>
+      </w:pPr>
+      <w:r>
+        <w:rPr>
+          <w:rFonts w:ascii="Consolas" w:cs="Consolas" w:eastAsia="Consolas" w:hAnsi="Consolas"/>
+          <w:sz w:val="16"/>
+          <w:szCs w:val="16"/>
+        </w:rPr>
+        <w:t xml:space="preserve">    d = datetime.strptime(re.sub(r"\D", ".", raw), "%d.%m.%Y")</w:t>
+      </w:r>
+    </w:p>
+    <w:p>
+      <w:pPr>
+        <w:shd w:val="clear" w:color="auto" w:fill="F2F2F2"/>
+        <w:spacing w:before="0" w:after="0" w:line="240" w:lineRule="auto"/>
+        <w:ind w:left="360" w:right="360"/>
+        <w:rPr>
+          <w:rFonts w:ascii="Consolas" w:cs="Consolas" w:eastAsia="Consolas" w:hAnsi="Consolas"/>
+          <w:sz w:val="16"/>
+        </w:rPr>
+      </w:pPr>
+      <w:r>
+        <w:rPr>
+          <w:rFonts w:ascii="Consolas" w:cs="Consolas" w:eastAsia="Consolas" w:hAnsi="Consolas"/>
+          <w:sz w:val="16"/>
+          <w:szCs w:val="16"/>
+        </w:rPr>
+        <w:t xml:space="preserve">    lines.append(f"{name} is {role} of the CSE (Data Science) department at DJSCE. "</w:t>
+      </w:r>
+    </w:p>
+    <w:p>
+      <w:pPr>
+        <w:shd w:val="clear" w:color="auto" w:fill="F2F2F2"/>
+        <w:spacing w:before="0" w:after="200" w:line="240" w:lineRule="auto"/>
+        <w:ind w:left="360" w:right="360"/>
+        <w:rPr>
+          <w:rFonts w:ascii="Consolas" w:cs="Consolas" w:eastAsia="Consolas" w:hAnsi="Consolas"/>
+          <w:sz w:val="16"/>
+        </w:rPr>
+      </w:pPr>
+      <w:r>
+        <w:rPr>
+          <w:rFonts w:ascii="Consolas" w:cs="Consolas" w:eastAsia="Consolas" w:hAnsi="Consolas"/>
+          <w:sz w:val="16"/>
+          <w:szCs w:val="16"/>
+        </w:rPr>
+        <w:t xml:space="preserve">                 f"Designation: {desig}. Joined on {d.day} {d:%B %Y}.")</w:t>
+      </w:r>
+    </w:p>
+    <w:p>
+      <w:pPr>
+        <w:pStyle w:val="Heading3"/>
+        <w:keepNext/>
+        <w:spacing w:before="240" w:after="120"/>
+        <w:rPr>
+          <w:rFonts w:ascii="Times New Roman" w:cs="Times New Roman" w:eastAsia="Times New Roman" w:hAnsi="Times New Roman"/>
+        </w:rPr>
+      </w:pPr>
+      <w:r>
+        <w:rPr>
+          <w:rFonts w:ascii="Times New Roman" w:cs="Times New Roman" w:eastAsia="Times New Roman" w:hAnsi="Times New Roman"/>
+          <w:b w:val="1"/>
+          <w:color w:val="000000"/>
+          <w:sz w:val="24"/>
+          <w:szCs w:val="24"/>
+        </w:rPr>
+        <w:t xml:space="preserve">2. Preprocessing and Storage (ingest.py)</w:t>
+      </w:r>
+    </w:p>
+    <w:p>
+      <w:pPr>
+        <w:numPr>
+          <w:ilvl w:val="0"/>
+          <w:numId w:val="9"/>
+        </w:numPr>
+        <w:spacing w:before="0" w:after="40"/>
+        <w:ind w:left="720" w:hanging="360"/>
+        <w:rPr>
+          <w:rFonts w:ascii="Times New Roman" w:cs="Times New Roman" w:eastAsia="Times New Roman" w:hAnsi="Times New Roman"/>
+        </w:rPr>
+      </w:pPr>
+      <w:r>
+        <w:rPr>
+          <w:rFonts w:ascii="Times New Roman" w:cs="Times New Roman" w:eastAsia="Times New Roman" w:hAnsi="Times New Roman"/>
+          <w:b w:val="1"/>
+        </w:rPr>
+        <w:t xml:space="preserve">Chunking:</w:t>
+      </w:r>
+      <w:r>
+        <w:rPr>
+          <w:rFonts w:ascii="Times New Roman" w:cs="Times New Roman" w:eastAsia="Times New Roman" w:hAnsi="Times New Roman"/>
+        </w:rPr>
+        <w:t xml:space="preserve"> each faculty member is one chunk. Each semester's scheme table, which lists every course, elective and credit, is kept whole as one chunk. The rest of the syllabus is split with RecursiveCharacterTextSplitter (chunk size 1200, overlap 150).</w:t>
+      </w:r>
+    </w:p>
+    <w:p>
+      <w:pPr>
+        <w:numPr>
+          <w:ilvl w:val="0"/>
+          <w:numId w:val="9"/>
+        </w:numPr>
+        <w:spacing w:before="0" w:after="40"/>
+        <w:ind w:left="720" w:hanging="360"/>
+        <w:rPr>
+          <w:rFonts w:ascii="Times New Roman" w:cs="Times New Roman" w:eastAsia="Times New Roman" w:hAnsi="Times New Roman"/>
+        </w:rPr>
+      </w:pPr>
+      <w:r>
+        <w:rPr>
+          <w:rFonts w:ascii="Times New Roman" w:cs="Times New Roman" w:eastAsia="Times New Roman" w:hAnsi="Times New Roman"/>
+          <w:b w:val="1"/>
+        </w:rPr>
+        <w:t xml:space="preserve">Metadata:</w:t>
+      </w:r>
+      <w:r>
+        <w:rPr>
+          <w:rFonts w:ascii="Times New Roman" w:cs="Times New Roman" w:eastAsia="Times New Roman" w:hAnsi="Times New Roman"/>
+        </w:rPr>
+        <w:t xml:space="preserve"> every syllabus chunk is prefixed with its semester, e.g. "[Semester 5 (5th semester, Third Year) ...]", and tagged with its semester number and kind (scheme or detail).</w:t>
+      </w:r>
+    </w:p>
+    <w:p>
+      <w:pPr>
+        <w:numPr>
+          <w:ilvl w:val="0"/>
+          <w:numId w:val="9"/>
+        </w:numPr>
+        <w:spacing w:before="0" w:after="160"/>
+        <w:ind w:left="720" w:hanging="360"/>
+        <w:rPr>
+          <w:rFonts w:ascii="Times New Roman" w:cs="Times New Roman" w:eastAsia="Times New Roman" w:hAnsi="Times New Roman"/>
+        </w:rPr>
+      </w:pPr>
+      <w:r>
+        <w:rPr>
+          <w:rFonts w:ascii="Times New Roman" w:cs="Times New Roman" w:eastAsia="Times New Roman" w:hAnsi="Times New Roman"/>
+          <w:b w:val="1"/>
+        </w:rPr>
+        <w:t xml:space="preserve">Embedding and storage:</w:t>
+      </w:r>
+      <w:r>
+        <w:rPr>
+          <w:rFonts w:ascii="Times New Roman" w:cs="Times New Roman" w:eastAsia="Times New Roman" w:hAnsi="Times New Roman"/>
+        </w:rPr>
+        <w:t xml:space="preserve"> the 633 chunks are embedded with all-MiniLM-L6-v2 and saved in a FAISS index on disk.</w:t>
+      </w:r>
+    </w:p>
+    <w:p>
+      <w:pPr>
+        <w:shd w:val="clear" w:color="auto" w:fill="F2F2F2"/>
+        <w:spacing w:before="80" w:after="0" w:line="240" w:lineRule="auto"/>
+        <w:ind w:left="360" w:right="360"/>
+        <w:rPr>
+          <w:rFonts w:ascii="Consolas" w:cs="Consolas" w:eastAsia="Consolas" w:hAnsi="Consolas"/>
+          <w:sz w:val="16"/>
+        </w:rPr>
+      </w:pPr>
+      <w:r>
+        <w:rPr>
+          <w:rFonts w:ascii="Consolas" w:cs="Consolas" w:eastAsia="Consolas" w:hAnsi="Consolas"/>
+          <w:sz w:val="16"/>
+          <w:szCs w:val="16"/>
+        </w:rPr>
+        <w:t xml:space="preserve">splitter = RecursiveCharacterTextSplitter(chunk_size=1200, chunk_overlap=150)</w:t>
+      </w:r>
+    </w:p>
+    <w:p>
+      <w:pPr>
+        <w:shd w:val="clear" w:color="auto" w:fill="F2F2F2"/>
+        <w:spacing w:before="0" w:after="0" w:line="240" w:lineRule="auto"/>
+        <w:ind w:left="360" w:right="360"/>
+        <w:rPr>
+          <w:rFonts w:ascii="Consolas" w:cs="Consolas" w:eastAsia="Consolas" w:hAnsi="Consolas"/>
+          <w:sz w:val="16"/>
+        </w:rPr>
+      </w:pPr>
+      <w:r>
+        <w:rPr>
+          <w:rFonts w:ascii="Consolas" w:cs="Consolas" w:eastAsia="Consolas" w:hAnsi="Consolas"/>
+          <w:sz w:val="16"/>
+          <w:szCs w:val="16"/>
+        </w:rPr>
+        <w:t xml:space="preserve">docs.append(Document(page_content=prefix + scheme_table,</w:t>
+      </w:r>
+    </w:p>
+    <w:p>
+      <w:pPr>
+        <w:shd w:val="clear" w:color="auto" w:fill="F2F2F2"/>
+        <w:spacing w:before="0" w:after="0" w:line="240" w:lineRule="auto"/>
+        <w:ind w:left="360" w:right="360"/>
+        <w:rPr>
+          <w:rFonts w:ascii="Consolas" w:cs="Consolas" w:eastAsia="Consolas" w:hAnsi="Consolas"/>
+          <w:sz w:val="16"/>
+        </w:rPr>
+      </w:pPr>
+      <w:r>
+        <w:rPr>
+          <w:rFonts w:ascii="Consolas" w:cs="Consolas" w:eastAsia="Consolas" w:hAnsi="Consolas"/>
+          <w:sz w:val="16"/>
+          <w:szCs w:val="16"/>
+        </w:rPr>
+        <w:t xml:space="preserve">                     metadata={"source": f.name, "semester": sem, "kind": "scheme"}))</w:t>
+      </w:r>
+    </w:p>
+    <w:p>
+      <w:pPr>
+        <w:shd w:val="clear" w:color="auto" w:fill="F2F2F2"/>
+        <w:spacing w:before="0" w:after="0" w:line="240" w:lineRule="auto"/>
+        <w:ind w:left="360" w:right="360"/>
+        <w:rPr>
+          <w:rFonts w:ascii="Consolas" w:cs="Consolas" w:eastAsia="Consolas" w:hAnsi="Consolas"/>
+          <w:sz w:val="16"/>
+        </w:rPr>
+      </w:pPr>
+      <w:r>
+        <w:rPr>
+          <w:rFonts w:ascii="Consolas" w:cs="Consolas" w:eastAsia="Consolas" w:hAnsi="Consolas"/>
+          <w:sz w:val="16"/>
+          <w:szCs w:val="16"/>
+        </w:rPr>
+        <w:t xml:space="preserve">embeddings = HuggingFaceEmbeddings(model_name="sentence-transformers/all-MiniLM-L6-v2")</w:t>
+      </w:r>
+    </w:p>
+    <w:p>
+      <w:pPr>
+        <w:shd w:val="clear" w:color="auto" w:fill="F2F2F2"/>
+        <w:spacing w:before="0" w:after="200" w:line="240" w:lineRule="auto"/>
+        <w:ind w:left="360" w:right="360"/>
+        <w:rPr>
+          <w:rFonts w:ascii="Consolas" w:cs="Consolas" w:eastAsia="Consolas" w:hAnsi="Consolas"/>
+          <w:sz w:val="16"/>
+        </w:rPr>
+      </w:pPr>
+      <w:r>
+        <w:rPr>
+          <w:rFonts w:ascii="Consolas" w:cs="Consolas" w:eastAsia="Consolas" w:hAnsi="Consolas"/>
+          <w:sz w:val="16"/>
+          <w:szCs w:val="16"/>
+        </w:rPr>
+        <w:t xml:space="preserve">FAISS.from_documents(docs, embeddings).save_local("store")</w:t>
+      </w:r>
+    </w:p>
+    <w:p>
+      <w:pPr>
+        <w:pStyle w:val="Heading3"/>
+        <w:keepNext/>
+        <w:spacing w:before="240" w:after="120"/>
+        <w:rPr>
+          <w:rFonts w:ascii="Times New Roman" w:cs="Times New Roman" w:eastAsia="Times New Roman" w:hAnsi="Times New Roman"/>
+        </w:rPr>
+      </w:pPr>
+      <w:r>
+        <w:rPr>
+          <w:rFonts w:ascii="Times New Roman" w:cs="Times New Roman" w:eastAsia="Times New Roman" w:hAnsi="Times New Roman"/>
+          <w:b w:val="1"/>
+          <w:color w:val="000000"/>
+          <w:sz w:val="24"/>
+          <w:szCs w:val="24"/>
+        </w:rPr>
+        <w:t xml:space="preserve">3. RAG Pipeline (rag.py)</w:t>
+      </w:r>
+    </w:p>
+    <w:p>
+      <w:pPr>
+        <w:numPr>
+          <w:ilvl w:val="0"/>
+          <w:numId w:val="9"/>
+        </w:numPr>
+        <w:spacing w:before="0" w:after="40"/>
+        <w:ind w:left="720" w:hanging="360"/>
+        <w:rPr>
+          <w:rFonts w:ascii="Times New Roman" w:cs="Times New Roman" w:eastAsia="Times New Roman" w:hAnsi="Times New Roman"/>
+        </w:rPr>
+      </w:pPr>
+      <w:r>
+        <w:rPr>
+          <w:rFonts w:ascii="Times New Roman" w:cs="Times New Roman" w:eastAsia="Times New Roman" w:hAnsi="Times New Roman"/>
+          <w:b w:val="1"/>
+        </w:rPr>
+        <w:t xml:space="preserve">Query routing:</w:t>
+      </w:r>
+      <w:r>
+        <w:rPr>
+          <w:rFonts w:ascii="Times New Roman" w:cs="Times New Roman" w:eastAsia="Times New Roman" w:hAnsi="Times New Roman"/>
+        </w:rPr>
+        <w:t xml:space="preserve"> a small LLM call with structured output (a Pydantic model) turns each question into a standalone question and returns its topic and semesters. For example, "tell me their names" after a question about new teachers is rewritten to name those teachers, and "third year, second half" is mapped to Semester 6.</w:t>
+      </w:r>
+    </w:p>
+    <w:p>
+      <w:pPr>
+        <w:numPr>
+          <w:ilvl w:val="0"/>
+          <w:numId w:val="9"/>
+        </w:numPr>
+        <w:spacing w:before="0" w:after="40"/>
+        <w:ind w:left="720" w:hanging="360"/>
+        <w:rPr>
+          <w:rFonts w:ascii="Times New Roman" w:cs="Times New Roman" w:eastAsia="Times New Roman" w:hAnsi="Times New Roman"/>
+        </w:rPr>
+      </w:pPr>
+      <w:r>
+        <w:rPr>
+          <w:rFonts w:ascii="Times New Roman" w:cs="Times New Roman" w:eastAsia="Times New Roman" w:hAnsi="Times New Roman"/>
+          <w:b w:val="1"/>
+        </w:rPr>
+        <w:t xml:space="preserve">Retrieval:</w:t>
+      </w:r>
+      <w:r>
+        <w:rPr>
+          <w:rFonts w:ascii="Times New Roman" w:cs="Times New Roman" w:eastAsia="Times New Roman" w:hAnsi="Times New Roman"/>
+        </w:rPr>
+        <w:t xml:space="preserve"> the embedding model cannot reliably tell "5th semester" from "6th semester", so the semesters become a FAISS metadata filter, and that semester's scheme table is always included. Faculty questions receive the complete faculty list, so counting questions such as "how many teachers joined before 2025?" are answered correctly. Department questions receive the About Us text.</w:t>
+      </w:r>
+    </w:p>
+    <w:p>
+      <w:pPr>
+        <w:numPr>
+          <w:ilvl w:val="0"/>
+          <w:numId w:val="9"/>
+        </w:numPr>
+        <w:spacing w:before="0" w:after="160"/>
+        <w:ind w:left="720" w:hanging="360"/>
+        <w:rPr>
+          <w:rFonts w:ascii="Times New Roman" w:cs="Times New Roman" w:eastAsia="Times New Roman" w:hAnsi="Times New Roman"/>
+        </w:rPr>
+      </w:pPr>
+      <w:r>
+        <w:rPr>
+          <w:rFonts w:ascii="Times New Roman" w:cs="Times New Roman" w:eastAsia="Times New Roman" w:hAnsi="Times New Roman"/>
+          <w:b w:val="1"/>
+        </w:rPr>
+        <w:t xml:space="preserve">Generation:</w:t>
+      </w:r>
+      <w:r>
+        <w:rPr>
+          <w:rFonts w:ascii="Times New Roman" w:cs="Times New Roman" w:eastAsia="Times New Roman" w:hAnsi="Times New Roman"/>
+        </w:rPr>
+        <w:t xml:space="preserve"> the retrieved chunks and the question are merged into a prompt that tells the model to answer only from the context and explains the course-code conventions (PE = elective, OE = open elective, L = laboratory). gpt-oss-120b generates the answer at temperature 0.</w:t>
+      </w:r>
+    </w:p>
+    <w:p>
+      <w:pPr>
+        <w:shd w:val="clear" w:color="auto" w:fill="F2F2F2"/>
+        <w:spacing w:before="80" w:after="0" w:line="240" w:lineRule="auto"/>
+        <w:ind w:left="360" w:right="360"/>
+        <w:rPr>
+          <w:rFonts w:ascii="Consolas" w:cs="Consolas" w:eastAsia="Consolas" w:hAnsi="Consolas"/>
+          <w:sz w:val="16"/>
+        </w:rPr>
+      </w:pPr>
+      <w:r>
+        <w:rPr>
+          <w:rFonts w:ascii="Consolas" w:cs="Consolas" w:eastAsia="Consolas" w:hAnsi="Consolas"/>
+          <w:sz w:val="16"/>
+          <w:szCs w:val="16"/>
+        </w:rPr>
+        <w:t xml:space="preserve">class Route(BaseModel):</w:t>
+      </w:r>
+    </w:p>
+    <w:p>
+      <w:pPr>
+        <w:shd w:val="clear" w:color="auto" w:fill="F2F2F2"/>
+        <w:spacing w:before="0" w:after="0" w:line="240" w:lineRule="auto"/>
+        <w:ind w:left="360" w:right="360"/>
+        <w:rPr>
+          <w:rFonts w:ascii="Consolas" w:cs="Consolas" w:eastAsia="Consolas" w:hAnsi="Consolas"/>
+          <w:sz w:val="16"/>
+        </w:rPr>
+      </w:pPr>
+      <w:r>
+        <w:rPr>
+          <w:rFonts w:ascii="Consolas" w:cs="Consolas" w:eastAsia="Consolas" w:hAnsi="Consolas"/>
+          <w:sz w:val="16"/>
+          <w:szCs w:val="16"/>
+        </w:rPr>
+        <w:t xml:space="preserve">    question: str                 # standalone rewrite of the question</w:t>
+      </w:r>
+    </w:p>
+    <w:p>
+      <w:pPr>
+        <w:shd w:val="clear" w:color="auto" w:fill="F2F2F2"/>
+        <w:spacing w:before="0" w:after="0" w:line="240" w:lineRule="auto"/>
+        <w:ind w:left="360" w:right="360"/>
+        <w:rPr>
+          <w:rFonts w:ascii="Consolas" w:cs="Consolas" w:eastAsia="Consolas" w:hAnsi="Consolas"/>
+          <w:sz w:val="16"/>
+        </w:rPr>
+      </w:pPr>
+      <w:r>
+        <w:rPr>
+          <w:rFonts w:ascii="Consolas" w:cs="Consolas" w:eastAsia="Consolas" w:hAnsi="Consolas"/>
+          <w:sz w:val="16"/>
+          <w:szCs w:val="16"/>
+        </w:rPr>
+        <w:t xml:space="preserve">    topic: Literal["faculty", "department", "syllabus", "other"]</w:t>
+      </w:r>
+    </w:p>
+    <w:p>
+      <w:pPr>
+        <w:shd w:val="clear" w:color="auto" w:fill="F2F2F2"/>
+        <w:spacing w:before="0" w:after="0" w:line="240" w:lineRule="auto"/>
+        <w:ind w:left="360" w:right="360"/>
+        <w:rPr>
+          <w:rFonts w:ascii="Consolas" w:cs="Consolas" w:eastAsia="Consolas" w:hAnsi="Consolas"/>
+          <w:sz w:val="16"/>
+        </w:rPr>
+      </w:pPr>
+      <w:r>
+        <w:rPr>
+          <w:rFonts w:ascii="Consolas" w:cs="Consolas" w:eastAsia="Consolas" w:hAnsi="Consolas"/>
+          <w:sz w:val="16"/>
+          <w:szCs w:val="16"/>
+        </w:rPr>
+        <w:t xml:space="preserve">    semesters: list[int]          # e.g. "third year, second half" -&gt; [6]</w:t>
+      </w:r>
+    </w:p>
+    <w:p>
+      <w:pPr>
+        <w:shd w:val="clear" w:color="auto" w:fill="F2F2F2"/>
+        <w:spacing w:before="0" w:after="0" w:line="240" w:lineRule="auto"/>
+        <w:ind w:left="360" w:right="360"/>
+        <w:rPr>
+          <w:rFonts w:ascii="Consolas" w:cs="Consolas" w:eastAsia="Consolas" w:hAnsi="Consolas"/>
+          <w:sz w:val="16"/>
+        </w:rPr>
+      </w:pPr>
+      <w:r>
+        <w:rPr>
+          <w:rFonts w:ascii="Consolas" w:cs="Consolas" w:eastAsia="Consolas" w:hAnsi="Consolas"/>
+          <w:sz w:val="16"/>
+          <w:szCs w:val="16"/>
+        </w:rPr>
+        <w:t xml:space="preserve"/>
+      </w:r>
+    </w:p>
+    <w:p>
+      <w:pPr>
+        <w:shd w:val="clear" w:color="auto" w:fill="F2F2F2"/>
+        <w:spacing w:before="0" w:after="0" w:line="240" w:lineRule="auto"/>
+        <w:ind w:left="360" w:right="360"/>
+        <w:rPr>
+          <w:rFonts w:ascii="Consolas" w:cs="Consolas" w:eastAsia="Consolas" w:hAnsi="Consolas"/>
+          <w:sz w:val="16"/>
+        </w:rPr>
+      </w:pPr>
+      <w:r>
+        <w:rPr>
+          <w:rFonts w:ascii="Consolas" w:cs="Consolas" w:eastAsia="Consolas" w:hAnsi="Consolas"/>
+          <w:sz w:val="16"/>
+          <w:szCs w:val="16"/>
+        </w:rPr>
+        <w:t xml:space="preserve">router = ROUTER | ChatGroq(model="openai/gpt-oss-20b").with_structured_output(Route)</w:t>
+      </w:r>
+    </w:p>
+    <w:p>
+      <w:pPr>
+        <w:shd w:val="clear" w:color="auto" w:fill="F2F2F2"/>
+        <w:spacing w:before="0" w:after="0" w:line="240" w:lineRule="auto"/>
+        <w:ind w:left="360" w:right="360"/>
+        <w:rPr>
+          <w:rFonts w:ascii="Consolas" w:cs="Consolas" w:eastAsia="Consolas" w:hAnsi="Consolas"/>
+          <w:sz w:val="16"/>
+        </w:rPr>
+      </w:pPr>
+      <w:r>
+        <w:rPr>
+          <w:rFonts w:ascii="Consolas" w:cs="Consolas" w:eastAsia="Consolas" w:hAnsi="Consolas"/>
+          <w:sz w:val="16"/>
+          <w:szCs w:val="16"/>
+        </w:rPr>
+        <w:t xml:space="preserve">llm = ChatGroq(model="openai/gpt-oss-120b", temperature=0)</w:t>
+      </w:r>
+    </w:p>
+    <w:p>
+      <w:pPr>
+        <w:shd w:val="clear" w:color="auto" w:fill="F2F2F2"/>
+        <w:spacing w:before="0" w:after="200" w:line="240" w:lineRule="auto"/>
+        <w:ind w:left="360" w:right="360"/>
+        <w:rPr>
+          <w:rFonts w:ascii="Consolas" w:cs="Consolas" w:eastAsia="Consolas" w:hAnsi="Consolas"/>
+          <w:sz w:val="16"/>
+        </w:rPr>
+      </w:pPr>
+      <w:r>
+        <w:rPr>
+          <w:rFonts w:ascii="Consolas" w:cs="Consolas" w:eastAsia="Consolas" w:hAnsi="Consolas"/>
+          <w:sz w:val="16"/>
+          <w:szCs w:val="16"/>
+        </w:rPr>
+        <w:t xml:space="preserve">chain = PROMPT | llm | StrOutputParser()</w:t>
+      </w:r>
+    </w:p>
+    <w:p>
+      <w:pPr>
+        <w:pStyle w:val="Heading3"/>
+        <w:keepNext/>
+        <w:spacing w:before="240" w:after="120"/>
+        <w:rPr>
+          <w:rFonts w:ascii="Times New Roman" w:cs="Times New Roman" w:eastAsia="Times New Roman" w:hAnsi="Times New Roman"/>
+        </w:rPr>
+      </w:pPr>
+      <w:r>
+        <w:rPr>
+          <w:rFonts w:ascii="Times New Roman" w:cs="Times New Roman" w:eastAsia="Times New Roman" w:hAnsi="Times New Roman"/>
+          <w:b w:val="1"/>
+          <w:color w:val="000000"/>
+          <w:sz w:val="24"/>
+          <w:szCs w:val="24"/>
+        </w:rPr>
+        <w:t xml:space="preserve">4. Frontend Integration (app.py)</w:t>
+      </w:r>
+    </w:p>
+    <w:p>
+      <w:pPr>
+        <w:numPr>
+          <w:ilvl w:val="0"/>
+          <w:numId w:val="9"/>
+        </w:numPr>
+        <w:spacing w:before="0" w:after="40"/>
+        <w:ind w:left="720" w:hanging="360"/>
+        <w:rPr>
+          <w:rFonts w:ascii="Times New Roman" w:cs="Times New Roman" w:eastAsia="Times New Roman" w:hAnsi="Times New Roman"/>
+        </w:rPr>
+      </w:pPr>
+      <w:r>
+        <w:rPr>
+          <w:rFonts w:ascii="Times New Roman" w:cs="Times New Roman" w:eastAsia="Times New Roman" w:hAnsi="Times New Roman"/>
+        </w:rPr>
+        <w:t xml:space="preserve">A Streamlit chat interface (st.chat_input and st.chat_message). The chat history is kept in the session and passed to the query router, so follow-up questions work.</w:t>
+      </w:r>
+    </w:p>
+    <w:p>
+      <w:pPr>
+        <w:numPr>
+          <w:ilvl w:val="0"/>
+          <w:numId w:val="9"/>
+        </w:numPr>
+        <w:spacing w:before="0" w:after="40"/>
+        <w:ind w:left="720" w:hanging="360"/>
+        <w:rPr>
+          <w:rFonts w:ascii="Times New Roman" w:cs="Times New Roman" w:eastAsia="Times New Roman" w:hAnsi="Times New Roman"/>
+        </w:rPr>
+      </w:pPr>
+      <w:r>
+        <w:rPr>
+          <w:rFonts w:ascii="Times New Roman" w:cs="Times New Roman" w:eastAsia="Times New Roman" w:hAnsi="Times New Roman"/>
+        </w:rPr>
+        <w:t xml:space="preserve">The vector store and models are loaded once with st.cache_resource. The Groq API key is read from a .env file locally, or from Streamlit Secrets when deployed.</w:t>
+      </w:r>
+    </w:p>
+    <w:p>
+      <w:pPr>
+        <w:numPr>
+          <w:ilvl w:val="0"/>
+          <w:numId w:val="9"/>
+        </w:numPr>
+        <w:spacing w:before="0" w:after="160"/>
+        <w:ind w:left="720" w:hanging="360"/>
+        <w:rPr>
+          <w:rFonts w:ascii="Times New Roman" w:cs="Times New Roman" w:eastAsia="Times New Roman" w:hAnsi="Times New Roman"/>
+        </w:rPr>
+      </w:pPr>
+      <w:r>
+        <w:rPr>
+          <w:rFonts w:ascii="Times New Roman" w:cs="Times New Roman" w:eastAsia="Times New Roman" w:hAnsi="Times New Roman"/>
+        </w:rPr>
+        <w:t xml:space="preserve">The app is deployed on Streamlit Community Cloud. It installs a CPU-only build of PyTorch to stay within the free tier's limits, and redeploys automatically on every push to GitHub.</w:t>
+      </w:r>
+    </w:p>
+    <w:p>
+      <w:pPr>
+        <w:spacing w:before="360" w:after="160"/>
+        <w:rPr>
+          <w:rFonts w:ascii="Times New Roman" w:cs="Times New Roman" w:eastAsia="Times New Roman" w:hAnsi="Times New Roman"/>
+        </w:rPr>
+      </w:pPr>
+      <w:r>
+        <w:rPr>
+          <w:rFonts w:ascii="Times New Roman" w:cs="Times New Roman" w:eastAsia="Times New Roman" w:hAnsi="Times New Roman"/>
+          <w:b w:val="1"/>
+        </w:rPr>
+        <w:t xml:space="preserve">Output:</w:t>
+      </w:r>
+    </w:p>
+    <w:p>
+      <w:pPr>
+        <w:spacing w:after="160"/>
+        <w:rPr>
+          <w:rFonts w:ascii="Times New Roman" w:cs="Times New Roman" w:eastAsia="Times New Roman" w:hAnsi="Times New Roman"/>
+        </w:rPr>
+      </w:pPr>
+      <w:r>
+        <w:rPr>
+          <w:rFonts w:ascii="Times New Roman" w:cs="Times New Roman" w:eastAsia="Times New Roman" w:hAnsi="Times New Roman"/>
+        </w:rPr>
+        <w:t xml:space="preserve">The chatbot was tested with the three expected queries from the exercise, and with indirect and follow-up questions. The answers match the department website and the syllabus PDFs. Questions outside the collected data (for example, the MBA fee structure) are answered with "I don't know" instead of a made-up answer.</w:t>
+      </w:r>
+    </w:p>
+    <w:p>
+      <w:pPr>
+        <w:keepNext/>
+        <w:spacing w:before="200" w:after="80"/>
+        <w:jc w:val="center"/>
+        <w:rPr>
+          <w:rFonts w:ascii="Times New Roman" w:cs="Times New Roman" w:eastAsia="Times New Roman" w:hAnsi="Times New Roman"/>
+        </w:rPr>
+      </w:pPr>
+      <w:r>
+        <w:rPr>
+          <w:rFonts w:ascii="Times New Roman" w:cs="Times New Roman" w:eastAsia="Times New Roman" w:hAnsi="Times New Roman"/>
+        </w:rPr>
+        <w:drawing>
+          <wp:inline distB="0" distT="0" distL="0" distR="0">
+            <wp:extent cx="5486400" cy="1386755"/>
+            <wp:effectExtent b="0" l="0" r="0" t="0"/>
+            <wp:docPr id="201" name="q1_hod.png"/>
+            <a:graphic>
+              <a:graphicData uri="http://schemas.openxmlformats.org/drawingml/2006/picture">
+                <pic:pic>
+                  <pic:nvPicPr>
+                    <pic:cNvPr id="0" name="q1_hod.png"/>
+                    <pic:cNvPicPr/>
+                  </pic:nvPicPr>
+                  <pic:blipFill>
+                    <a:blip r:embed="rId203"/>
+                    <a:stretch>
+                      <a:fillRect/>
+                    </a:stretch>
+                  </pic:blipFill>
+                  <pic:spPr>
+                    <a:xfrm>
+                      <a:off x="0" y="0"/>
+                      <a:ext cx="5486400" cy="1386755"/>
+                    </a:xfrm>
+                    <a:prstGeom prst="rect">
+                      <a:avLst/>
+                    </a:prstGeom>
+                    <a:ln w="6350">
+                      <a:solidFill>
+                        <a:srgbClr val="BFBFBF"/>
+                      </a:solidFill>
+                    </a:ln>
+                  </pic:spPr>
+                </pic:pic>
+              </a:graphicData>
+            </a:graphic>
+          </wp:inline>
+        </w:drawing>
+      </w:r>
+    </w:p>
+    <w:p>
+      <w:pPr>
+        <w:spacing w:after="240"/>
+        <w:jc w:val="center"/>
+        <w:rPr>
+          <w:rFonts w:ascii="Times New Roman" w:cs="Times New Roman" w:eastAsia="Times New Roman" w:hAnsi="Times New Roman"/>
+        </w:rPr>
+      </w:pPr>
+      <w:r>
+        <w:rPr>
+          <w:rFonts w:ascii="Times New Roman" w:cs="Times New Roman" w:eastAsia="Times New Roman" w:hAnsi="Times New Roman"/>
+          <w:i w:val="1"/>
+        </w:rPr>
+        <w:t xml:space="preserve">Fig 2. Expected query 1: "Who is the HOD for CSE DS department?"</w:t>
+      </w:r>
+    </w:p>
+    <w:p>
+      <w:pPr>
+        <w:keepNext/>
+        <w:spacing w:before="200" w:after="80"/>
+        <w:jc w:val="center"/>
+        <w:rPr>
+          <w:rFonts w:ascii="Times New Roman" w:cs="Times New Roman" w:eastAsia="Times New Roman" w:hAnsi="Times New Roman"/>
+        </w:rPr>
+      </w:pPr>
+      <w:r>
+        <w:rPr>
+          <w:rFonts w:ascii="Times New Roman" w:cs="Times New Roman" w:eastAsia="Times New Roman" w:hAnsi="Times New Roman"/>
+        </w:rPr>
+        <w:drawing>
+          <wp:inline distB="0" distT="0" distL="0" distR="0">
+            <wp:extent cx="3840480" cy="8216717"/>
+            <wp:effectExtent b="0" l="0" r="0" t="0"/>
+            <wp:docPr id="202" name="q2_sem5.png"/>
+            <a:graphic>
+              <a:graphicData uri="http://schemas.openxmlformats.org/drawingml/2006/picture">
+                <pic:pic>
+                  <pic:nvPicPr>
+                    <pic:cNvPr id="0" name="q2_sem5.png"/>
+                    <pic:cNvPicPr/>
+                  </pic:nvPicPr>
+                  <pic:blipFill>
+                    <a:blip r:embed="rId204"/>
+                    <a:stretch>
+                      <a:fillRect/>
+                    </a:stretch>
+                  </pic:blipFill>
+                  <pic:spPr>
+                    <a:xfrm>
+                      <a:off x="0" y="0"/>
+                      <a:ext cx="3840480" cy="8216717"/>
+                    </a:xfrm>
+                    <a:prstGeom prst="rect">
+                      <a:avLst/>
+                    </a:prstGeom>
+                    <a:ln w="6350">
+                      <a:solidFill>
+                        <a:srgbClr val="BFBFBF"/>
+                      </a:solidFill>
+                    </a:ln>
+                  </pic:spPr>
+                </pic:pic>
+              </a:graphicData>
+            </a:graphic>
+          </wp:inline>
+        </w:drawing>
+      </w:r>
+    </w:p>
+    <w:p>
+      <w:pPr>
+        <w:spacing w:after="240"/>
+        <w:jc w:val="center"/>
+        <w:rPr>
+          <w:rFonts w:ascii="Times New Roman" w:cs="Times New Roman" w:eastAsia="Times New Roman" w:hAnsi="Times New Roman"/>
+        </w:rPr>
+      </w:pPr>
+      <w:r>
+        <w:rPr>
+          <w:rFonts w:ascii="Times New Roman" w:cs="Times New Roman" w:eastAsia="Times New Roman" w:hAnsi="Times New Roman"/>
+          <w:i w:val="1"/>
+        </w:rPr>
+        <w:t xml:space="preserve">Fig 3. Expected query 2: "What subjects are taught in the 5th semester?"</w:t>
+      </w:r>
+    </w:p>
+    <w:p>
+      <w:pPr>
+        <w:keepNext/>
+        <w:spacing w:before="200" w:after="80"/>
+        <w:jc w:val="center"/>
+        <w:rPr>
+          <w:rFonts w:ascii="Times New Roman" w:cs="Times New Roman" w:eastAsia="Times New Roman" w:hAnsi="Times New Roman"/>
+        </w:rPr>
+      </w:pPr>
+      <w:r>
+        <w:rPr>
+          <w:rFonts w:ascii="Times New Roman" w:cs="Times New Roman" w:eastAsia="Times New Roman" w:hAnsi="Times New Roman"/>
+        </w:rPr>
+        <w:drawing>
+          <wp:inline distB="0" distT="0" distL="0" distR="0">
+            <wp:extent cx="5120640" cy="6627126"/>
+            <wp:effectExtent b="0" l="0" r="0" t="0"/>
+            <wp:docPr id="203" name="q3_sem6_electives.png"/>
+            <a:graphic>
+              <a:graphicData uri="http://schemas.openxmlformats.org/drawingml/2006/picture">
+                <pic:pic>
+                  <pic:nvPicPr>
+                    <pic:cNvPr id="0" name="q3_sem6_electives.png"/>
+                    <pic:cNvPicPr/>
+                  </pic:nvPicPr>
+                  <pic:blipFill>
+                    <a:blip r:embed="rId205"/>
+                    <a:stretch>
+                      <a:fillRect/>
+                    </a:stretch>
+                  </pic:blipFill>
+                  <pic:spPr>
+                    <a:xfrm>
+                      <a:off x="0" y="0"/>
+                      <a:ext cx="5120640" cy="6627126"/>
+                    </a:xfrm>
+                    <a:prstGeom prst="rect">
+                      <a:avLst/>
+                    </a:prstGeom>
+                    <a:ln w="6350">
+                      <a:solidFill>
+                        <a:srgbClr val="BFBFBF"/>
+                      </a:solidFill>
+                    </a:ln>
+                  </pic:spPr>
+                </pic:pic>
+              </a:graphicData>
+            </a:graphic>
+          </wp:inline>
+        </w:drawing>
+      </w:r>
+    </w:p>
+    <w:p>
+      <w:pPr>
+        <w:spacing w:after="240"/>
+        <w:jc w:val="center"/>
+        <w:rPr>
+          <w:rFonts w:ascii="Times New Roman" w:cs="Times New Roman" w:eastAsia="Times New Roman" w:hAnsi="Times New Roman"/>
+        </w:rPr>
+      </w:pPr>
+      <w:r>
+        <w:rPr>
+          <w:rFonts w:ascii="Times New Roman" w:cs="Times New Roman" w:eastAsia="Times New Roman" w:hAnsi="Times New Roman"/>
+          <w:i w:val="1"/>
+        </w:rPr>
+        <w:t xml:space="preserve">Fig 4. Expected query 3: "What are some electives a student can choose from in the 6th semester?"</w:t>
+      </w:r>
+    </w:p>
+    <w:p>
+      <w:pPr>
+        <w:keepNext/>
+        <w:spacing w:before="200" w:after="80"/>
+        <w:jc w:val="center"/>
+        <w:rPr>
+          <w:rFonts w:ascii="Times New Roman" w:cs="Times New Roman" w:eastAsia="Times New Roman" w:hAnsi="Times New Roman"/>
+        </w:rPr>
+      </w:pPr>
+      <w:r>
+        <w:rPr>
+          <w:rFonts w:ascii="Times New Roman" w:cs="Times New Roman" w:eastAsia="Times New Roman" w:hAnsi="Times New Roman"/>
+        </w:rPr>
+        <w:drawing>
+          <wp:inline distB="0" distT="0" distL="0" distR="0">
+            <wp:extent cx="4480560" cy="4734293"/>
+            <wp:effectExtent b="0" l="0" r="0" t="0"/>
+            <wp:docPr id="204" name="q4_followups.png"/>
+            <a:graphic>
+              <a:graphicData uri="http://schemas.openxmlformats.org/drawingml/2006/picture">
+                <pic:pic>
+                  <pic:nvPicPr>
+                    <pic:cNvPr id="0" name="q4_followups.png"/>
+                    <pic:cNvPicPr/>
+                  </pic:nvPicPr>
+                  <pic:blipFill>
+                    <a:blip r:embed="rId206"/>
+                    <a:stretch>
+                      <a:fillRect/>
+                    </a:stretch>
+                  </pic:blipFill>
+                  <pic:spPr>
+                    <a:xfrm>
+                      <a:off x="0" y="0"/>
+                      <a:ext cx="4480560" cy="4734293"/>
+                    </a:xfrm>
+                    <a:prstGeom prst="rect">
+                      <a:avLst/>
+                    </a:prstGeom>
+                    <a:ln w="6350">
+                      <a:solidFill>
+                        <a:srgbClr val="BFBFBF"/>
+                      </a:solidFill>
+                    </a:ln>
+                  </pic:spPr>
+                </pic:pic>
+              </a:graphicData>
+            </a:graphic>
+          </wp:inline>
+        </w:drawing>
+      </w:r>
+    </w:p>
+    <w:p>
+      <w:pPr>
+        <w:spacing w:after="240"/>
+        <w:jc w:val="center"/>
+        <w:rPr>
+          <w:rFonts w:ascii="Times New Roman" w:cs="Times New Roman" w:eastAsia="Times New Roman" w:hAnsi="Times New Roman"/>
+        </w:rPr>
+      </w:pPr>
+      <w:r>
+        <w:rPr>
+          <w:rFonts w:ascii="Times New Roman" w:cs="Times New Roman" w:eastAsia="Times New Roman" w:hAnsi="Times New Roman"/>
+          <w:i w:val="1"/>
+        </w:rPr>
+        <w:t xml:space="preserve">Fig 5. Indirect and follow-up questions: the HOD's length of service is calculated from the joining date, and "their" in the last question refers back to the previous answer.</w:t>
+      </w:r>
+    </w:p>
+    <w:p>
+      <w:pPr>
+        <w:spacing w:before="360" w:after="160"/>
+        <w:rPr>
+          <w:rFonts w:ascii="Times New Roman" w:cs="Times New Roman" w:eastAsia="Times New Roman" w:hAnsi="Times New Roman"/>
+        </w:rPr>
+      </w:pPr>
+      <w:r>
+        <w:rPr>
+          <w:rFonts w:ascii="Times New Roman" w:cs="Times New Roman" w:eastAsia="Times New Roman" w:hAnsi="Times New Roman"/>
+          <w:b w:val="1"/>
+        </w:rPr>
+        <w:t xml:space="preserve">Conclusion:</w:t>
+      </w:r>
+    </w:p>
+    <w:p>
+      <w:pPr>
+        <w:spacing w:after="160"/>
+        <w:rPr>
+          <w:rFonts w:ascii="Times New Roman" w:cs="Times New Roman" w:eastAsia="Times New Roman" w:hAnsi="Times New Roman"/>
+        </w:rPr>
+      </w:pPr>
+      <w:r>
+        <w:rPr>
+          <w:rFonts w:ascii="Times New Roman" w:cs="Times New Roman" w:eastAsia="Times New Roman" w:hAnsi="Times New Roman"/>
+        </w:rPr>
+        <w:t xml:space="preserve">In this experiment, a Retrieval-Augmented Generation (RAG) chatbot for the CSE (Data Science) department of D. J. Sanghvi College of Engineering was developed using LangChain. Faculty details, department information and the DJS23 syllabus for all eight semesters were scraped, converted to text, split into chunks, embedded with all-MiniLM-L6-v2 and stored in a FAISS vector database. For every question, the most relevant chunks are retrieved and passed to an LLM, which answers only from that context. The answers are therefore grounded in the college's own data, and the chatbot says it does not know instead of hallucinating when the information is missing.</w:t>
+      </w:r>
+    </w:p>
+    <w:p>
+      <w:pPr>
+        <w:spacing w:after="160"/>
+        <w:rPr>
+          <w:rFonts w:ascii="Times New Roman" w:cs="Times New Roman" w:eastAsia="Times New Roman" w:hAnsi="Times New Roman"/>
+        </w:rPr>
+      </w:pPr>
+      <w:r>
+        <w:rPr>
+          <w:rFonts w:ascii="Times New Roman" w:cs="Times New Roman" w:eastAsia="Times New Roman" w:hAnsi="Times New Roman"/>
+        </w:rPr>
+        <w:t xml:space="preserve">The experiment also showed the limits of plain similarity search: a small embedding model cannot tell semesters apart, and top-k retrieval cannot answer counting questions over the whole faculty list. Metadata filters, keeping the scheme tables as whole chunks, and an LLM-based query router solved these problems, and allowed the chatbot to handle indirect and follow-up questions. The final system is deployed as a public web app on Streamlit Community Cloud.</w:t>
       </w:r>
     </w:p>
     <w:sectPr>

</xml_diff>